<commit_message>
Sync schedule content with updated DOCX
</commit_message>
<xml_diff>
--- a/2026 ASI Southwest Spring Convention Schedule.docx
+++ b/2026 ASI Southwest Spring Convention Schedule.docx
@@ -1119,7 +1119,7 @@
           <w:szCs w:val="24"/>
           <w:rtl w:val="0"/>
         </w:rPr>
-        <w:t xml:space="preserve">“This seminar is still being titled” — Claudio Japas, </w:t>
+        <w:t xml:space="preserve">“What Medicine Didn’t Teach Us About Health” — Claudio Japas, </w:t>
       </w:r>
       <w:r>
         <w:rPr>
@@ -2421,12 +2421,16 @@
       <w:r>
         <w:rPr>
           <w:rFonts w:ascii="Times New Roman" w:cs="Times New Roman" w:eastAsia="Times New Roman" w:hAnsi="Times New Roman"/>
-          <w:color w:val="ff0000"/>
-          <w:sz w:val="24"/>
-          <w:szCs w:val="24"/>
-          <w:rtl w:val="0"/>
-        </w:rPr>
-        <w:t xml:space="preserve">WAITING TO HEAR FROM VIOLINIST</w:t>
+          <w:sz w:val="24"/>
+          <w:szCs w:val="24"/>
+          <w:rtl w:val="0"/>
+        </w:rPr>
+        <w:t xml:space="preserve">Melashenko Family</w:t>
+      </w:r>
+      <w:r>
+        <w:rPr>
+          <w:rtl w:val="0"/>
+        </w:rPr>
       </w:r>
     </w:p>
     <w:p>
@@ -2489,37 +2493,6 @@
           <w:rtl w:val="0"/>
         </w:rPr>
         <w:t xml:space="preserve"> “The Sanctuary &amp; Health,” — Don Mackintosh, Senior Pastor, Weimar University Church</w:t>
-      </w:r>
-    </w:p>
-    <w:p>
-      <w:pPr>
-        <w:spacing w:line="240" w:lineRule="auto"/>
-        <w:ind w:left="851" w:firstLine="0"/>
-        <w:rPr>
-          <w:rFonts w:ascii="Times New Roman" w:cs="Times New Roman" w:eastAsia="Times New Roman" w:hAnsi="Times New Roman"/>
-          <w:sz w:val="24"/>
-          <w:szCs w:val="24"/>
-        </w:rPr>
-      </w:pPr>
-      <w:r>
-        <w:rPr>
-          <w:rFonts w:ascii="Times New Roman" w:cs="Times New Roman" w:eastAsia="Times New Roman" w:hAnsi="Times New Roman"/>
-          <w:b w:val="1"/>
-          <w:bCs w:val="1"/>
-          <w:sz w:val="24"/>
-          <w:szCs w:val="24"/>
-          <w:rtl w:val="0"/>
-        </w:rPr>
-        <w:t xml:space="preserve">Special Music:</w:t>
-      </w:r>
-      <w:r>
-        <w:rPr>
-          <w:rFonts w:ascii="Times New Roman" w:cs="Times New Roman" w:eastAsia="Times New Roman" w:hAnsi="Times New Roman"/>
-          <w:sz w:val="24"/>
-          <w:szCs w:val="24"/>
-          <w:rtl w:val="0"/>
-        </w:rPr>
-        <w:t xml:space="preserve"> Melashenko Family</w:t>
       </w:r>
     </w:p>
     <w:p>
@@ -4511,40 +4484,6 @@
           <w:rtl w:val="0"/>
         </w:rPr>
         <w:t xml:space="preserve">Nedley, Medical Director, Nedley Health </w:t>
-      </w:r>
-    </w:p>
-    <w:p>
-      <w:pPr>
-        <w:spacing w:line="240" w:lineRule="auto"/>
-        <w:ind w:firstLine="720"/>
-        <w:rPr>
-          <w:rFonts w:ascii="Times New Roman" w:cs="Times New Roman" w:eastAsia="Times New Roman" w:hAnsi="Times New Roman"/>
-          <w:color w:val="ff0000"/>
-          <w:sz w:val="24"/>
-          <w:szCs w:val="24"/>
-        </w:rPr>
-      </w:pPr>
-      <w:r>
-        <w:rPr>
-          <w:rFonts w:ascii="Times New Roman" w:cs="Times New Roman" w:eastAsia="Times New Roman" w:hAnsi="Times New Roman"/>
-          <w:b w:val="1"/>
-          <w:bCs w:val="1"/>
-          <w:color w:val="ff0000"/>
-          <w:sz w:val="24"/>
-          <w:szCs w:val="24"/>
-          <w:rtl w:val="0"/>
-        </w:rPr>
-        <w:t xml:space="preserve">Special Music:</w:t>
-      </w:r>
-      <w:r>
-        <w:rPr>
-          <w:rFonts w:ascii="Times New Roman" w:cs="Times New Roman" w:eastAsia="Times New Roman" w:hAnsi="Times New Roman"/>
-          <w:color w:val="ff0000"/>
-          <w:sz w:val="24"/>
-          <w:szCs w:val="24"/>
-          <w:rtl w:val="0"/>
-        </w:rPr>
-        <w:t xml:space="preserve"> “Need Title”, Melashenko Trio ASK IF THEY WANT TO ADD A SONG</w:t>
       </w:r>
     </w:p>
     <w:p>

</xml_diff>